<commit_message>
Version update and specification Develop
</commit_message>
<xml_diff>
--- a/SDLC_Group1.docx
+++ b/SDLC_Group1.docx
@@ -9866,7 +9866,23 @@
           <w:sz w:val="24"/>
           <w:szCs w:val="24"/>
         </w:rPr>
-        <w:t xml:space="preserve"> (10 </w:t>
+        <w:t xml:space="preserve"> (</w:t>
+      </w:r>
+      <w:r>
+        <w:rPr>
+          <w:rFonts w:ascii="Times New Roman" w:hAnsi="Times New Roman" w:cs="Times New Roman"/>
+          <w:sz w:val="24"/>
+          <w:szCs w:val="24"/>
+        </w:rPr>
+        <w:t>8</w:t>
+      </w:r>
+      <w:r>
+        <w:rPr>
+          <w:rFonts w:ascii="Times New Roman" w:hAnsi="Times New Roman" w:cs="Times New Roman"/>
+          <w:sz w:val="24"/>
+          <w:szCs w:val="24"/>
+        </w:rPr>
+        <w:t xml:space="preserve"> </w:t>
       </w:r>
       <w:proofErr w:type="spellStart"/>
       <w:r>
@@ -10301,23 +10317,24 @@
       </w:pPr>
       <w:r>
         <w:rPr>
-          <w:noProof/>
-          <w14:ligatures w14:val="standardContextual"/>
+          <w:rFonts w:ascii="Times New Roman" w:hAnsi="Times New Roman" w:cs="Times New Roman"/>
+          <w:sz w:val="24"/>
+          <w:szCs w:val="24"/>
         </w:rPr>
         <w:lastRenderedPageBreak/>
         <w:drawing>
-          <wp:anchor distT="0" distB="0" distL="114300" distR="114300" simplePos="0" relativeHeight="251659264" behindDoc="0" locked="0" layoutInCell="1" allowOverlap="1" wp14:anchorId="36F0A3AD" wp14:editId="1844C3CF">
+          <wp:anchor distT="0" distB="0" distL="114300" distR="114300" simplePos="0" relativeHeight="251659264" behindDoc="0" locked="0" layoutInCell="1" allowOverlap="1" wp14:anchorId="388D72E9" wp14:editId="71813FFB">
             <wp:simplePos x="0" y="0"/>
-            <wp:positionH relativeFrom="margin">
-              <wp:posOffset>-245110</wp:posOffset>
+            <wp:positionH relativeFrom="column">
+              <wp:posOffset>-228600</wp:posOffset>
             </wp:positionH>
             <wp:positionV relativeFrom="paragraph">
-              <wp:posOffset>371475</wp:posOffset>
+              <wp:posOffset>19050</wp:posOffset>
             </wp:positionV>
-            <wp:extent cx="9535160" cy="4179570"/>
-            <wp:effectExtent l="0" t="0" r="8890" b="0"/>
+            <wp:extent cx="9629775" cy="4305300"/>
+            <wp:effectExtent l="0" t="0" r="9525" b="0"/>
             <wp:wrapTopAndBottom/>
-            <wp:docPr id="940891722" name="Picture 4"/>
+            <wp:docPr id="994926482" name="Picture 1"/>
             <wp:cNvGraphicFramePr>
               <a:graphicFrameLocks xmlns:a="http://schemas.openxmlformats.org/drawingml/2006/main" noChangeAspect="1"/>
             </wp:cNvGraphicFramePr>
@@ -10325,7 +10342,7 @@
               <a:graphicData uri="http://schemas.openxmlformats.org/drawingml/2006/picture">
                 <pic:pic xmlns:pic="http://schemas.openxmlformats.org/drawingml/2006/picture">
                   <pic:nvPicPr>
-                    <pic:cNvPr id="940891722" name="Picture 940891722"/>
+                    <pic:cNvPr id="994926482" name=""/>
                     <pic:cNvPicPr/>
                   </pic:nvPicPr>
                   <pic:blipFill>
@@ -10343,7 +10360,7 @@
                   <pic:spPr>
                     <a:xfrm>
                       <a:off x="0" y="0"/>
-                      <a:ext cx="9535160" cy="4179570"/>
+                      <a:ext cx="9629775" cy="4305300"/>
                     </a:xfrm>
                     <a:prstGeom prst="rect">
                       <a:avLst/>
@@ -10731,7 +10748,7 @@
                 <w:sz w:val="20"/>
                 <w:szCs w:val="20"/>
               </w:rPr>
-              <w:t>Minggu</w:t>
+              <w:t>periode</w:t>
             </w:r>
             <w:proofErr w:type="spellEnd"/>
           </w:p>
@@ -10978,7 +10995,7 @@
                 <w:sz w:val="20"/>
                 <w:szCs w:val="20"/>
               </w:rPr>
-              <w:t>Minggu</w:t>
+              <w:t>periode</w:t>
             </w:r>
             <w:proofErr w:type="spellEnd"/>
           </w:p>
@@ -11111,7 +11128,23 @@
                 <w:sz w:val="20"/>
                 <w:szCs w:val="20"/>
               </w:rPr>
-              <w:t xml:space="preserve"> 1 Mar </w:t>
+              <w:t xml:space="preserve"> 1 </w:t>
+            </w:r>
+            <w:r>
+              <w:rPr>
+                <w:rFonts w:ascii="Times New Roman" w:hAnsi="Times New Roman" w:cs="Times New Roman"/>
+                <w:sz w:val="20"/>
+                <w:szCs w:val="20"/>
+              </w:rPr>
+              <w:t>April</w:t>
+            </w:r>
+            <w:r>
+              <w:rPr>
+                <w:rFonts w:ascii="Times New Roman" w:hAnsi="Times New Roman" w:cs="Times New Roman"/>
+                <w:sz w:val="20"/>
+                <w:szCs w:val="20"/>
+              </w:rPr>
+              <w:t xml:space="preserve"> </w:t>
             </w:r>
             <w:r>
               <w:rPr>
@@ -11145,7 +11178,23 @@
                 <w:sz w:val="20"/>
                 <w:szCs w:val="20"/>
               </w:rPr>
-              <w:t xml:space="preserve"> 2 Mei</w:t>
+              <w:t xml:space="preserve"> </w:t>
+            </w:r>
+            <w:r>
+              <w:rPr>
+                <w:rFonts w:ascii="Times New Roman" w:hAnsi="Times New Roman" w:cs="Times New Roman"/>
+                <w:sz w:val="20"/>
+                <w:szCs w:val="20"/>
+              </w:rPr>
+              <w:t>4</w:t>
+            </w:r>
+            <w:r>
+              <w:rPr>
+                <w:rFonts w:ascii="Times New Roman" w:hAnsi="Times New Roman" w:cs="Times New Roman"/>
+                <w:sz w:val="20"/>
+                <w:szCs w:val="20"/>
+              </w:rPr>
+              <w:t xml:space="preserve"> Mei</w:t>
             </w:r>
           </w:p>
         </w:tc>
@@ -11170,7 +11219,15 @@
                 <w:sz w:val="20"/>
                 <w:szCs w:val="20"/>
               </w:rPr>
-              <w:t xml:space="preserve">10 </w:t>
+              <w:t>8</w:t>
+            </w:r>
+            <w:r>
+              <w:rPr>
+                <w:rFonts w:ascii="Times New Roman" w:hAnsi="Times New Roman" w:cs="Times New Roman"/>
+                <w:sz w:val="20"/>
+                <w:szCs w:val="20"/>
+              </w:rPr>
+              <w:t xml:space="preserve"> </w:t>
             </w:r>
             <w:proofErr w:type="spellStart"/>
             <w:r>
@@ -11179,7 +11236,7 @@
                 <w:sz w:val="20"/>
                 <w:szCs w:val="20"/>
               </w:rPr>
-              <w:t>Minggu</w:t>
+              <w:t>periode</w:t>
             </w:r>
             <w:proofErr w:type="spellEnd"/>
           </w:p>
@@ -11438,7 +11495,23 @@
                 <w:sz w:val="20"/>
                 <w:szCs w:val="20"/>
               </w:rPr>
-              <w:t xml:space="preserve"> 2 Mei </w:t>
+              <w:t xml:space="preserve"> </w:t>
+            </w:r>
+            <w:r>
+              <w:rPr>
+                <w:rFonts w:ascii="Times New Roman" w:hAnsi="Times New Roman" w:cs="Times New Roman"/>
+                <w:sz w:val="20"/>
+                <w:szCs w:val="20"/>
+              </w:rPr>
+              <w:t>4</w:t>
+            </w:r>
+            <w:r>
+              <w:rPr>
+                <w:rFonts w:ascii="Times New Roman" w:hAnsi="Times New Roman" w:cs="Times New Roman"/>
+                <w:sz w:val="20"/>
+                <w:szCs w:val="20"/>
+              </w:rPr>
+              <w:t xml:space="preserve"> Mei </w:t>
             </w:r>
             <w:r>
               <w:rPr>
@@ -11472,7 +11545,31 @@
                 <w:sz w:val="20"/>
                 <w:szCs w:val="20"/>
               </w:rPr>
-              <w:t xml:space="preserve"> 3 Mei</w:t>
+              <w:t xml:space="preserve"> </w:t>
+            </w:r>
+            <w:r>
+              <w:rPr>
+                <w:rFonts w:ascii="Times New Roman" w:hAnsi="Times New Roman" w:cs="Times New Roman"/>
+                <w:sz w:val="20"/>
+                <w:szCs w:val="20"/>
+              </w:rPr>
+              <w:t>1</w:t>
+            </w:r>
+            <w:r>
+              <w:rPr>
+                <w:rFonts w:ascii="Times New Roman" w:hAnsi="Times New Roman" w:cs="Times New Roman"/>
+                <w:sz w:val="20"/>
+                <w:szCs w:val="20"/>
+              </w:rPr>
+              <w:t xml:space="preserve"> </w:t>
+            </w:r>
+            <w:r>
+              <w:rPr>
+                <w:rFonts w:ascii="Times New Roman" w:hAnsi="Times New Roman" w:cs="Times New Roman"/>
+                <w:sz w:val="20"/>
+                <w:szCs w:val="20"/>
+              </w:rPr>
+              <w:t>Juni</w:t>
             </w:r>
           </w:p>
         </w:tc>
@@ -11506,7 +11603,7 @@
                 <w:sz w:val="20"/>
                 <w:szCs w:val="20"/>
               </w:rPr>
-              <w:t>Minggu</w:t>
+              <w:t>periode</w:t>
             </w:r>
             <w:proofErr w:type="spellEnd"/>
           </w:p>
@@ -11696,7 +11793,39 @@
                 <w:sz w:val="20"/>
                 <w:szCs w:val="20"/>
               </w:rPr>
-              <w:t xml:space="preserve"> 3 Mei </w:t>
+              <w:t xml:space="preserve"> </w:t>
+            </w:r>
+            <w:r>
+              <w:rPr>
+                <w:rFonts w:ascii="Times New Roman" w:hAnsi="Times New Roman" w:cs="Times New Roman"/>
+                <w:sz w:val="20"/>
+                <w:szCs w:val="20"/>
+              </w:rPr>
+              <w:t>1</w:t>
+            </w:r>
+            <w:r>
+              <w:rPr>
+                <w:rFonts w:ascii="Times New Roman" w:hAnsi="Times New Roman" w:cs="Times New Roman"/>
+                <w:sz w:val="20"/>
+                <w:szCs w:val="20"/>
+              </w:rPr>
+              <w:t xml:space="preserve"> </w:t>
+            </w:r>
+            <w:r>
+              <w:rPr>
+                <w:rFonts w:ascii="Times New Roman" w:hAnsi="Times New Roman" w:cs="Times New Roman"/>
+                <w:sz w:val="20"/>
+                <w:szCs w:val="20"/>
+              </w:rPr>
+              <w:t>Jun</w:t>
+            </w:r>
+            <w:r>
+              <w:rPr>
+                <w:rFonts w:ascii="Times New Roman" w:hAnsi="Times New Roman" w:cs="Times New Roman"/>
+                <w:sz w:val="20"/>
+                <w:szCs w:val="20"/>
+              </w:rPr>
+              <w:t xml:space="preserve"> </w:t>
             </w:r>
             <w:r>
               <w:rPr>
@@ -11730,7 +11859,23 @@
                 <w:sz w:val="20"/>
                 <w:szCs w:val="20"/>
               </w:rPr>
-              <w:t xml:space="preserve"> 1 Jun</w:t>
+              <w:t xml:space="preserve"> </w:t>
+            </w:r>
+            <w:r>
+              <w:rPr>
+                <w:rFonts w:ascii="Times New Roman" w:hAnsi="Times New Roman" w:cs="Times New Roman"/>
+                <w:sz w:val="20"/>
+                <w:szCs w:val="20"/>
+              </w:rPr>
+              <w:t>2</w:t>
+            </w:r>
+            <w:r>
+              <w:rPr>
+                <w:rFonts w:ascii="Times New Roman" w:hAnsi="Times New Roman" w:cs="Times New Roman"/>
+                <w:sz w:val="20"/>
+                <w:szCs w:val="20"/>
+              </w:rPr>
+              <w:t xml:space="preserve"> Jun</w:t>
             </w:r>
           </w:p>
         </w:tc>
@@ -11755,7 +11900,15 @@
                 <w:sz w:val="20"/>
                 <w:szCs w:val="20"/>
               </w:rPr>
-              <w:t xml:space="preserve">3 </w:t>
+              <w:t>2</w:t>
+            </w:r>
+            <w:r>
+              <w:rPr>
+                <w:rFonts w:ascii="Times New Roman" w:hAnsi="Times New Roman" w:cs="Times New Roman"/>
+                <w:sz w:val="20"/>
+                <w:szCs w:val="20"/>
+              </w:rPr>
+              <w:t xml:space="preserve"> </w:t>
             </w:r>
             <w:proofErr w:type="spellStart"/>
             <w:r>
@@ -11764,7 +11917,7 @@
                 <w:sz w:val="20"/>
                 <w:szCs w:val="20"/>
               </w:rPr>
-              <w:t>Minggu</w:t>
+              <w:t>periode</w:t>
             </w:r>
             <w:proofErr w:type="spellEnd"/>
           </w:p>
@@ -18696,7 +18849,23 @@
           <w:sz w:val="24"/>
           <w:szCs w:val="24"/>
         </w:rPr>
-        <w:t xml:space="preserve">, 10 </w:t>
+        <w:t xml:space="preserve">, </w:t>
+      </w:r>
+      <w:r>
+        <w:rPr>
+          <w:rFonts w:ascii="Times New Roman" w:hAnsi="Times New Roman" w:cs="Times New Roman"/>
+          <w:sz w:val="24"/>
+          <w:szCs w:val="24"/>
+        </w:rPr>
+        <w:t>8</w:t>
+      </w:r>
+      <w:r>
+        <w:rPr>
+          <w:rFonts w:ascii="Times New Roman" w:hAnsi="Times New Roman" w:cs="Times New Roman"/>
+          <w:sz w:val="24"/>
+          <w:szCs w:val="24"/>
+        </w:rPr>
+        <w:t xml:space="preserve"> </w:t>
       </w:r>
       <w:proofErr w:type="spellStart"/>
       <w:r>

</xml_diff>